<commit_message>
GameOf Life Corr (requested by MH)
</commit_message>
<xml_diff>
--- a/09_Zweidimensionale_Arrays/Übungen/GameOfLife/GameOfLife.docx
+++ b/09_Zweidimensionale_Arrays/Übungen/GameOfLife/GameOfLife.docx
@@ -1,18 +1,13 @@
 
 <file path=word/document.xml><?xml version="1.0" encoding="utf-8"?>
-<w:document xmlns:wpc="http://schemas.microsoft.com/office/word/2010/wordprocessingCanvas" xmlns:mc="http://schemas.openxmlformats.org/markup-compatibility/2006" xmlns:o="urn:schemas-microsoft-com:office:office" xmlns:r="http://schemas.openxmlformats.org/officeDocument/2006/relationships" xmlns:m="http://schemas.openxmlformats.org/officeDocument/2006/math" xmlns:v="urn:schemas-microsoft-com:vml" xmlns:wp14="http://schemas.microsoft.com/office/word/2010/wordprocessingDrawing" xmlns:wp="http://schemas.openxmlformats.org/drawingml/2006/wordprocessingDrawing" xmlns:w10="urn:schemas-microsoft-com:office:word" xmlns:w="http://schemas.openxmlformats.org/wordprocessingml/2006/main" xmlns:w14="http://schemas.microsoft.com/office/word/2010/wordml" xmlns:w15="http://schemas.microsoft.com/office/word/2012/wordml" xmlns:wpg="http://schemas.microsoft.com/office/word/2010/wordprocessingGroup" xmlns:wpi="http://schemas.microsoft.com/office/word/2010/wordprocessingInk" xmlns:wne="http://schemas.microsoft.com/office/word/2006/wordml" xmlns:wps="http://schemas.microsoft.com/office/word/2010/wordprocessingShape" mc:Ignorable="w14 w15 wp14">
+<w:document xmlns:wpc="http://schemas.microsoft.com/office/word/2010/wordprocessingCanvas" xmlns:cx="http://schemas.microsoft.com/office/drawing/2014/chartex" xmlns:cx1="http://schemas.microsoft.com/office/drawing/2015/9/8/chartex" xmlns:cx2="http://schemas.microsoft.com/office/drawing/2015/10/21/chartex" xmlns:cx3="http://schemas.microsoft.com/office/drawing/2016/5/9/chartex" xmlns:cx4="http://schemas.microsoft.com/office/drawing/2016/5/10/chartex" xmlns:cx5="http://schemas.microsoft.com/office/drawing/2016/5/11/chartex" xmlns:cx6="http://schemas.microsoft.com/office/drawing/2016/5/12/chartex" xmlns:cx7="http://schemas.microsoft.com/office/drawing/2016/5/13/chartex" xmlns:cx8="http://schemas.microsoft.com/office/drawing/2016/5/14/chartex" xmlns:mc="http://schemas.openxmlformats.org/markup-compatibility/2006" xmlns:aink="http://schemas.microsoft.com/office/drawing/2016/ink" xmlns:am3d="http://schemas.microsoft.com/office/drawing/2017/model3d" xmlns:o="urn:schemas-microsoft-com:office:office" xmlns:r="http://schemas.openxmlformats.org/officeDocument/2006/relationships" xmlns:m="http://schemas.openxmlformats.org/officeDocument/2006/math" xmlns:v="urn:schemas-microsoft-com:vml" xmlns:wp14="http://schemas.microsoft.com/office/word/2010/wordprocessingDrawing" xmlns:wp="http://schemas.openxmlformats.org/drawingml/2006/wordprocessingDrawing" xmlns:w10="urn:schemas-microsoft-com:office:word" xmlns:w="http://schemas.openxmlformats.org/wordprocessingml/2006/main" xmlns:w14="http://schemas.microsoft.com/office/word/2010/wordml" xmlns:w15="http://schemas.microsoft.com/office/word/2012/wordml" xmlns:w16cex="http://schemas.microsoft.com/office/word/2018/wordml/cex" xmlns:w16cid="http://schemas.microsoft.com/office/word/2016/wordml/cid" xmlns:w16="http://schemas.microsoft.com/office/word/2018/wordml" xmlns:w16sdtdh="http://schemas.microsoft.com/office/word/2020/wordml/sdtdatahash" xmlns:w16se="http://schemas.microsoft.com/office/word/2015/wordml/symex" xmlns:wpg="http://schemas.microsoft.com/office/word/2010/wordprocessingGroup" xmlns:wpi="http://schemas.microsoft.com/office/word/2010/wordprocessingInk" xmlns:wne="http://schemas.microsoft.com/office/word/2006/wordml" xmlns:wps="http://schemas.microsoft.com/office/word/2010/wordprocessingShape" mc:Ignorable="w14 w15 w16se w16cid w16 w16cex w16sdtdh wp14">
   <w:body>
     <w:p>
       <w:pPr>
         <w:pStyle w:val="berschrift2"/>
       </w:pPr>
       <w:r>
-        <w:t>Leh</w:t>
-      </w:r>
-      <w:bookmarkStart w:id="0" w:name="_GoBack"/>
-      <w:bookmarkEnd w:id="0"/>
-      <w:r>
-        <w:t>rziele:</w:t>
+        <w:t>Lehrziele:</w:t>
       </w:r>
     </w:p>
     <w:p>
@@ -57,12 +52,12 @@
       <w:pPr>
         <w:pStyle w:val="berschrift2"/>
       </w:pPr>
-      <w:bookmarkStart w:id="1" w:name="_Hlk89767996"/>
+      <w:bookmarkStart w:id="0" w:name="_Hlk89767996"/>
       <w:r>
         <w:t>Aufgabenstellung</w:t>
       </w:r>
     </w:p>
-    <w:bookmarkEnd w:id="1"/>
+    <w:bookmarkEnd w:id="0"/>
     <w:p>
       <w:pPr>
         <w:autoSpaceDE w:val="0"/>
@@ -201,7 +196,6 @@
           <w:lang w:val="en-US"/>
         </w:rPr>
       </w:pPr>
-      <w:proofErr w:type="gramStart"/>
       <w:r>
         <w:rPr>
           <w:rFonts w:ascii="Cascadia Mono" w:hAnsi="Cascadia Mono" w:cs="Cascadia Mono"/>
@@ -212,7 +206,6 @@
         </w:rPr>
         <w:t>public</w:t>
       </w:r>
-      <w:proofErr w:type="gramEnd"/>
       <w:r>
         <w:rPr>
           <w:rFonts w:ascii="Cascadia Mono" w:hAnsi="Cascadia Mono" w:cs="Cascadia Mono"/>
@@ -243,6 +236,7 @@
         </w:rPr>
         <w:t xml:space="preserve"> </w:t>
       </w:r>
+      <w:proofErr w:type="gramStart"/>
       <w:r>
         <w:rPr>
           <w:rFonts w:ascii="Cascadia Mono" w:hAnsi="Cascadia Mono" w:cs="Cascadia Mono"/>
@@ -261,9 +255,9 @@
           <w:szCs w:val="19"/>
           <w:lang w:val="en-US"/>
         </w:rPr>
-        <w:t xml:space="preserve">[,] </w:t>
-      </w:r>
-      <w:proofErr w:type="spellStart"/>
+        <w:t>[</w:t>
+      </w:r>
+      <w:proofErr w:type="gramEnd"/>
       <w:r>
         <w:rPr>
           <w:rFonts w:ascii="Cascadia Mono" w:hAnsi="Cascadia Mono" w:cs="Cascadia Mono"/>
@@ -272,9 +266,9 @@
           <w:szCs w:val="19"/>
           <w:lang w:val="en-US"/>
         </w:rPr>
-        <w:t>CalculateNextGeneration</w:t>
-      </w:r>
-      <w:proofErr w:type="spellEnd"/>
+        <w:t xml:space="preserve">,] </w:t>
+      </w:r>
+      <w:proofErr w:type="spellStart"/>
       <w:r>
         <w:rPr>
           <w:rFonts w:ascii="Cascadia Mono" w:hAnsi="Cascadia Mono" w:cs="Cascadia Mono"/>
@@ -283,6 +277,17 @@
           <w:szCs w:val="19"/>
           <w:lang w:val="en-US"/>
         </w:rPr>
+        <w:t>CalculateNextGeneration</w:t>
+      </w:r>
+      <w:proofErr w:type="spellEnd"/>
+      <w:r>
+        <w:rPr>
+          <w:rFonts w:ascii="Cascadia Mono" w:hAnsi="Cascadia Mono" w:cs="Cascadia Mono"/>
+          <w:color w:val="000000"/>
+          <w:sz w:val="19"/>
+          <w:szCs w:val="19"/>
+          <w:lang w:val="en-US"/>
+        </w:rPr>
         <w:t>(</w:t>
       </w:r>
       <w:r>
@@ -310,7 +315,6 @@
       <w:r>
         <w:t xml:space="preserve">die aus einer gegebenen Population </w:t>
       </w:r>
-      <w:proofErr w:type="spellStart"/>
       <w:r>
         <w:rPr>
           <w:rFonts w:ascii="Cascadia Mono" w:hAnsi="Cascadia Mono" w:cs="Cascadia Mono"/>
@@ -321,7 +325,6 @@
         </w:rPr>
         <w:t>world</w:t>
       </w:r>
-      <w:proofErr w:type="spellEnd"/>
       <w:r>
         <w:t xml:space="preserve"> die nächste Generation berechnet. Das Programm soll</w:t>
       </w:r>
@@ -394,15 +397,7 @@
         <w:t xml:space="preserve"> </w:t>
       </w:r>
       <w:r>
-        <w:t>dass das Verhalten „chaotisch“ und „</w:t>
-      </w:r>
-      <w:proofErr w:type="spellStart"/>
-      <w:r>
-        <w:t>unvorhersagbar</w:t>
-      </w:r>
-      <w:proofErr w:type="spellEnd"/>
-      <w:r>
-        <w:t>“ (im mathematischen Sinne) ist. Im WWW</w:t>
+        <w:t>dass das Verhalten „chaotisch“ und „unvorhersagbar“ (im mathematischen Sinne) ist. Im WWW</w:t>
       </w:r>
       <w:r>
         <w:t xml:space="preserve"> </w:t>
@@ -434,14 +429,12 @@
       <w:r>
         <w:t xml:space="preserve">In dem bereitgestellten Programm-Template sind </w:t>
       </w:r>
-      <w:proofErr w:type="spellStart"/>
       <w:r>
         <w:rPr>
           <w:rFonts w:ascii="Courier New" w:hAnsi="Courier New" w:cs="Courier New"/>
         </w:rPr>
         <w:t>Unittests</w:t>
       </w:r>
-      <w:proofErr w:type="spellEnd"/>
       <w:r>
         <w:t xml:space="preserve"> vorhanden. Implementieren Sie die Methoden so, dass </w:t>
       </w:r>
@@ -453,37 +446,13 @@
         <w:t>alle</w:t>
       </w:r>
       <w:r>
-        <w:t xml:space="preserve"> </w:t>
-      </w:r>
-      <w:proofErr w:type="spellStart"/>
-      <w:r>
-        <w:t>Unittests</w:t>
-      </w:r>
-      <w:proofErr w:type="spellEnd"/>
-      <w:r>
-        <w:t xml:space="preserve"> erfolgreich ausgeführt werden können. Änderungen an den </w:t>
-      </w:r>
-      <w:proofErr w:type="spellStart"/>
-      <w:r>
-        <w:t>Unittests</w:t>
-      </w:r>
-      <w:proofErr w:type="spellEnd"/>
-      <w:r>
-        <w:t xml:space="preserve"> sind nicht erlaubt.</w:t>
+        <w:t xml:space="preserve"> Unittests erfolgreich ausgeführt werden können. Änderungen an den Unittests sind nicht erlaubt.</w:t>
       </w:r>
     </w:p>
     <w:p>
       <w:r>
         <w:lastRenderedPageBreak/>
-        <w:t xml:space="preserve">Zusätzlich zur oben beschriebenen Methode muss eine „Hilfsmethode“ implementiert werden –diese wird von den </w:t>
-      </w:r>
-      <w:proofErr w:type="spellStart"/>
-      <w:r>
-        <w:t>Unittest</w:t>
-      </w:r>
-      <w:proofErr w:type="spellEnd"/>
-      <w:r>
-        <w:t xml:space="preserve"> ebenfalls überprüft:</w:t>
+        <w:t>Zusätzlich zur oben beschriebenen Methode muss eine „Hilfsmethode“ implementiert werden –diese wird von den Unittest ebenfalls überprüft:</w:t>
       </w:r>
     </w:p>
     <w:p>
@@ -497,7 +466,6 @@
           <w:lang w:val="en-US"/>
         </w:rPr>
       </w:pPr>
-      <w:proofErr w:type="gramStart"/>
       <w:r>
         <w:rPr>
           <w:rFonts w:ascii="Cascadia Mono" w:hAnsi="Cascadia Mono" w:cs="Cascadia Mono"/>
@@ -508,7 +476,6 @@
         </w:rPr>
         <w:t>public</w:t>
       </w:r>
-      <w:proofErr w:type="gramEnd"/>
       <w:r>
         <w:rPr>
           <w:rFonts w:ascii="Cascadia Mono" w:hAnsi="Cascadia Mono" w:cs="Cascadia Mono"/>
@@ -539,7 +506,6 @@
         </w:rPr>
         <w:t xml:space="preserve"> </w:t>
       </w:r>
-      <w:proofErr w:type="spellStart"/>
       <w:r>
         <w:rPr>
           <w:rFonts w:ascii="Cascadia Mono" w:hAnsi="Cascadia Mono" w:cs="Cascadia Mono"/>
@@ -550,7 +516,6 @@
         </w:rPr>
         <w:t>int</w:t>
       </w:r>
-      <w:proofErr w:type="spellEnd"/>
       <w:r>
         <w:rPr>
           <w:rFonts w:ascii="Cascadia Mono" w:hAnsi="Cascadia Mono" w:cs="Cascadia Mono"/>
@@ -583,6 +548,7 @@
         </w:rPr>
         <w:t>(</w:t>
       </w:r>
+      <w:proofErr w:type="gramStart"/>
       <w:r>
         <w:rPr>
           <w:rFonts w:ascii="Cascadia Mono" w:hAnsi="Cascadia Mono" w:cs="Cascadia Mono"/>
@@ -601,9 +567,19 @@
           <w:szCs w:val="19"/>
           <w:lang w:val="en-US"/>
         </w:rPr>
-        <w:t xml:space="preserve">[,] world, </w:t>
-      </w:r>
-      <w:proofErr w:type="spellStart"/>
+        <w:t>[</w:t>
+      </w:r>
+      <w:proofErr w:type="gramEnd"/>
+      <w:r>
+        <w:rPr>
+          <w:rFonts w:ascii="Cascadia Mono" w:hAnsi="Cascadia Mono" w:cs="Cascadia Mono"/>
+          <w:color w:val="000000"/>
+          <w:sz w:val="19"/>
+          <w:szCs w:val="19"/>
+          <w:lang w:val="en-US"/>
+        </w:rPr>
+        <w:t xml:space="preserve">,] world, </w:t>
+      </w:r>
       <w:r>
         <w:rPr>
           <w:rFonts w:ascii="Cascadia Mono" w:hAnsi="Cascadia Mono" w:cs="Cascadia Mono"/>
@@ -614,7 +590,6 @@
         </w:rPr>
         <w:t>int</w:t>
       </w:r>
-      <w:proofErr w:type="spellEnd"/>
       <w:r>
         <w:rPr>
           <w:rFonts w:ascii="Cascadia Mono" w:hAnsi="Cascadia Mono" w:cs="Cascadia Mono"/>
@@ -625,7 +600,6 @@
         </w:rPr>
         <w:t xml:space="preserve"> row, </w:t>
       </w:r>
-      <w:proofErr w:type="spellStart"/>
       <w:r>
         <w:rPr>
           <w:rFonts w:ascii="Cascadia Mono" w:hAnsi="Cascadia Mono" w:cs="Cascadia Mono"/>
@@ -636,7 +610,6 @@
         </w:rPr>
         <w:t>int</w:t>
       </w:r>
-      <w:proofErr w:type="spellEnd"/>
       <w:r>
         <w:rPr>
           <w:rFonts w:ascii="Cascadia Mono" w:hAnsi="Cascadia Mono" w:cs="Cascadia Mono"/>
@@ -1377,7 +1350,16 @@
           <w:sz w:val="16"/>
           <w:szCs w:val="16"/>
         </w:rPr>
-        <w:t xml:space="preserve">    XXXX  </w:t>
+        <w:t xml:space="preserve">    </w:t>
+      </w:r>
+      <w:proofErr w:type="gramStart"/>
+      <w:r>
+        <w:rPr>
+          <w:rFonts w:ascii="Courier New" w:hAnsi="Courier New" w:cs="Courier New"/>
+          <w:sz w:val="16"/>
+          <w:szCs w:val="16"/>
+        </w:rPr>
+        <w:t xml:space="preserve">XXXX  </w:t>
       </w:r>
       <w:proofErr w:type="spellStart"/>
       <w:r>
@@ -1389,6 +1371,7 @@
         <w:t>XXXX</w:t>
       </w:r>
       <w:proofErr w:type="spellEnd"/>
+      <w:proofErr w:type="gramEnd"/>
     </w:p>
     <w:p>
       <w:pPr>
@@ -1577,6 +1560,33 @@
           <w:szCs w:val="16"/>
         </w:rPr>
       </w:pPr>
+      <w:r>
+        <w:rPr>
+          <w:rFonts w:ascii="Courier New" w:hAnsi="Courier New" w:cs="Courier New"/>
+          <w:sz w:val="16"/>
+          <w:szCs w:val="16"/>
+        </w:rPr>
+        <w:t>Start mit Eingabetaste ...</w:t>
+      </w:r>
+      <w:r>
+        <w:rPr>
+          <w:rFonts w:ascii="Courier New" w:hAnsi="Courier New" w:cs="Courier New"/>
+          <w:sz w:val="16"/>
+          <w:szCs w:val="16"/>
+        </w:rPr>
+        <w:br/>
+      </w:r>
+      <w:r>
+        <w:rPr>
+          <w:rFonts w:ascii="Courier New" w:hAnsi="Courier New" w:cs="Courier New"/>
+          <w:sz w:val="16"/>
+          <w:szCs w:val="16"/>
+        </w:rPr>
+        <w:br/>
+      </w:r>
+      <w:r>
+        <w:t>Nach dem Drücken der Eingabetaste</w:t>
+      </w:r>
     </w:p>
     <w:p>
       <w:pPr>
@@ -1595,14 +1605,6 @@
           <w:sz w:val="16"/>
           <w:szCs w:val="16"/>
         </w:rPr>
-        <w:t>Start mit Eingabetaste ...</w:t>
-      </w:r>
-      <w:r>
-        <w:rPr>
-          <w:rFonts w:ascii="Courier New" w:hAnsi="Courier New" w:cs="Courier New"/>
-          <w:sz w:val="16"/>
-          <w:szCs w:val="16"/>
-        </w:rPr>
         <w:br/>
       </w:r>
       <w:r>
@@ -1611,10 +1613,7 @@
           <w:sz w:val="16"/>
           <w:szCs w:val="16"/>
         </w:rPr>
-        <w:br/>
-      </w:r>
-      <w:r>
-        <w:t>Nach dem Drücken der Eingabetaste</w:t>
+        <w:t>Welt nach Runde: 1</w:t>
       </w:r>
     </w:p>
     <w:p>
@@ -1628,22 +1627,6 @@
           <w:szCs w:val="16"/>
         </w:rPr>
       </w:pPr>
-      <w:r>
-        <w:rPr>
-          <w:rFonts w:ascii="Courier New" w:hAnsi="Courier New" w:cs="Courier New"/>
-          <w:sz w:val="16"/>
-          <w:szCs w:val="16"/>
-        </w:rPr>
-        <w:br/>
-      </w:r>
-      <w:r>
-        <w:rPr>
-          <w:rFonts w:ascii="Courier New" w:hAnsi="Courier New" w:cs="Courier New"/>
-          <w:sz w:val="16"/>
-          <w:szCs w:val="16"/>
-        </w:rPr>
-        <w:t>Welt nach Runde: 1</w:t>
-      </w:r>
     </w:p>
     <w:p>
       <w:pPr>
@@ -1656,6 +1639,14 @@
           <w:szCs w:val="16"/>
         </w:rPr>
       </w:pPr>
+      <w:r>
+        <w:rPr>
+          <w:rFonts w:ascii="Courier New" w:hAnsi="Courier New" w:cs="Courier New"/>
+          <w:sz w:val="16"/>
+          <w:szCs w:val="16"/>
+        </w:rPr>
+        <w:t xml:space="preserve">          X</w:t>
+      </w:r>
     </w:p>
     <w:p>
       <w:pPr>
@@ -1668,6 +1659,14 @@
           <w:szCs w:val="16"/>
         </w:rPr>
       </w:pPr>
+      <w:r>
+        <w:rPr>
+          <w:rFonts w:ascii="Courier New" w:hAnsi="Courier New" w:cs="Courier New"/>
+          <w:sz w:val="16"/>
+          <w:szCs w:val="16"/>
+        </w:rPr>
+        <w:t xml:space="preserve">     XXXX</w:t>
+      </w:r>
     </w:p>
     <w:p>
       <w:pPr>
@@ -1686,7 +1685,7 @@
           <w:sz w:val="16"/>
           <w:szCs w:val="16"/>
         </w:rPr>
-        <w:t xml:space="preserve">          X XX</w:t>
+        <w:t xml:space="preserve">     XXX</w:t>
       </w:r>
     </w:p>
     <w:p>
@@ -1700,14 +1699,6 @@
           <w:szCs w:val="16"/>
         </w:rPr>
       </w:pPr>
-      <w:r>
-        <w:rPr>
-          <w:rFonts w:ascii="Courier New" w:hAnsi="Courier New" w:cs="Courier New"/>
-          <w:sz w:val="16"/>
-          <w:szCs w:val="16"/>
-        </w:rPr>
-        <w:t xml:space="preserve">     XXXX</w:t>
-      </w:r>
     </w:p>
     <w:p>
       <w:pPr>
@@ -1726,8 +1717,18 @@
           <w:sz w:val="16"/>
           <w:szCs w:val="16"/>
         </w:rPr>
-        <w:t xml:space="preserve">     XXX</w:t>
-      </w:r>
+        <w:t xml:space="preserve">       XX </w:t>
+      </w:r>
+      <w:proofErr w:type="spellStart"/>
+      <w:r>
+        <w:rPr>
+          <w:rFonts w:ascii="Courier New" w:hAnsi="Courier New" w:cs="Courier New"/>
+          <w:sz w:val="16"/>
+          <w:szCs w:val="16"/>
+        </w:rPr>
+        <w:t>XX</w:t>
+      </w:r>
+      <w:proofErr w:type="spellEnd"/>
     </w:p>
     <w:p>
       <w:pPr>
@@ -1740,6 +1741,24 @@
           <w:szCs w:val="16"/>
         </w:rPr>
       </w:pPr>
+      <w:r>
+        <w:rPr>
+          <w:rFonts w:ascii="Courier New" w:hAnsi="Courier New" w:cs="Courier New"/>
+          <w:sz w:val="16"/>
+          <w:szCs w:val="16"/>
+        </w:rPr>
+        <w:t xml:space="preserve">       X   </w:t>
+      </w:r>
+      <w:proofErr w:type="spellStart"/>
+      <w:r>
+        <w:rPr>
+          <w:rFonts w:ascii="Courier New" w:hAnsi="Courier New" w:cs="Courier New"/>
+          <w:sz w:val="16"/>
+          <w:szCs w:val="16"/>
+        </w:rPr>
+        <w:t>X</w:t>
+      </w:r>
+      <w:proofErr w:type="spellEnd"/>
     </w:p>
     <w:p>
       <w:pPr>
@@ -1758,7 +1777,7 @@
           <w:sz w:val="16"/>
           <w:szCs w:val="16"/>
         </w:rPr>
-        <w:t xml:space="preserve">    X  XX </w:t>
+        <w:t xml:space="preserve">       X    </w:t>
       </w:r>
       <w:proofErr w:type="spellStart"/>
       <w:r>
@@ -1767,17 +1786,9 @@
           <w:sz w:val="16"/>
           <w:szCs w:val="16"/>
         </w:rPr>
-        <w:t>XX</w:t>
+        <w:t>X</w:t>
       </w:r>
       <w:proofErr w:type="spellEnd"/>
-      <w:r>
-        <w:rPr>
-          <w:rFonts w:ascii="Courier New" w:hAnsi="Courier New" w:cs="Courier New"/>
-          <w:sz w:val="16"/>
-          <w:szCs w:val="16"/>
-        </w:rPr>
-        <w:t xml:space="preserve"> X</w:t>
-      </w:r>
     </w:p>
     <w:p>
       <w:pPr>
@@ -1796,36 +1807,8 @@
           <w:sz w:val="16"/>
           <w:szCs w:val="16"/>
         </w:rPr>
-        <w:t xml:space="preserve">       X   </w:t>
-      </w:r>
-      <w:proofErr w:type="spellStart"/>
-      <w:r>
-        <w:rPr>
-          <w:rFonts w:ascii="Courier New" w:hAnsi="Courier New" w:cs="Courier New"/>
-          <w:sz w:val="16"/>
-          <w:szCs w:val="16"/>
-        </w:rPr>
-        <w:t>X</w:t>
-      </w:r>
-      <w:proofErr w:type="spellEnd"/>
-      <w:r>
-        <w:rPr>
-          <w:rFonts w:ascii="Courier New" w:hAnsi="Courier New" w:cs="Courier New"/>
-          <w:sz w:val="16"/>
-          <w:szCs w:val="16"/>
-        </w:rPr>
-        <w:t xml:space="preserve"> </w:t>
-      </w:r>
-      <w:proofErr w:type="spellStart"/>
-      <w:r>
-        <w:rPr>
-          <w:rFonts w:ascii="Courier New" w:hAnsi="Courier New" w:cs="Courier New"/>
-          <w:sz w:val="16"/>
-          <w:szCs w:val="16"/>
-        </w:rPr>
-        <w:t>X</w:t>
-      </w:r>
-      <w:proofErr w:type="spellEnd"/>
+        <w:t xml:space="preserve">       X</w:t>
+      </w:r>
     </w:p>
     <w:p>
       <w:pPr>
@@ -1838,14 +1821,6 @@
           <w:szCs w:val="16"/>
         </w:rPr>
       </w:pPr>
-      <w:r>
-        <w:rPr>
-          <w:rFonts w:ascii="Courier New" w:hAnsi="Courier New" w:cs="Courier New"/>
-          <w:sz w:val="16"/>
-          <w:szCs w:val="16"/>
-        </w:rPr>
-        <w:t xml:space="preserve">       X    XX</w:t>
-      </w:r>
     </w:p>
     <w:p>
       <w:pPr>
@@ -1864,7 +1839,16 @@
           <w:sz w:val="16"/>
           <w:szCs w:val="16"/>
         </w:rPr>
-        <w:t xml:space="preserve">    X  </w:t>
+        <w:t xml:space="preserve">         </w:t>
+      </w:r>
+      <w:proofErr w:type="gramStart"/>
+      <w:r>
+        <w:rPr>
+          <w:rFonts w:ascii="Courier New" w:hAnsi="Courier New" w:cs="Courier New"/>
+          <w:sz w:val="16"/>
+          <w:szCs w:val="16"/>
+        </w:rPr>
+        <w:t xml:space="preserve">X  </w:t>
       </w:r>
       <w:proofErr w:type="spellStart"/>
       <w:r>
@@ -1876,6 +1860,7 @@
         <w:t>X</w:t>
       </w:r>
       <w:proofErr w:type="spellEnd"/>
+      <w:proofErr w:type="gramEnd"/>
     </w:p>
     <w:p>
       <w:pPr>
@@ -1888,14 +1873,6 @@
           <w:szCs w:val="16"/>
         </w:rPr>
       </w:pPr>
-      <w:r>
-        <w:rPr>
-          <w:rFonts w:ascii="Courier New" w:hAnsi="Courier New" w:cs="Courier New"/>
-          <w:sz w:val="16"/>
-          <w:szCs w:val="16"/>
-        </w:rPr>
-        <w:t xml:space="preserve">    X</w:t>
-      </w:r>
     </w:p>
     <w:p>
       <w:pPr>
@@ -1908,14 +1885,6 @@
           <w:szCs w:val="16"/>
         </w:rPr>
       </w:pPr>
-      <w:r>
-        <w:rPr>
-          <w:rFonts w:ascii="Courier New" w:hAnsi="Courier New" w:cs="Courier New"/>
-          <w:sz w:val="16"/>
-          <w:szCs w:val="16"/>
-        </w:rPr>
-        <w:t xml:space="preserve">           XXX</w:t>
-      </w:r>
     </w:p>
     <w:p>
       <w:pPr>
@@ -1928,6 +1897,27 @@
           <w:szCs w:val="16"/>
         </w:rPr>
       </w:pPr>
+      <w:r>
+        <w:rPr>
+          <w:rFonts w:ascii="Courier New" w:hAnsi="Courier New" w:cs="Courier New"/>
+          <w:sz w:val="16"/>
+          <w:szCs w:val="16"/>
+        </w:rPr>
+        <w:t>Eingabetaste für nächste Runde oder x für Ende:</w:t>
+      </w:r>
+      <w:r>
+        <w:rPr>
+          <w:rFonts w:ascii="Courier New" w:hAnsi="Courier New" w:cs="Courier New"/>
+          <w:sz w:val="16"/>
+          <w:szCs w:val="16"/>
+        </w:rPr>
+        <w:br/>
+      </w:r>
+    </w:p>
+    <w:p>
+      <w:r>
+        <w:t>Nach dem Drücken der Eingabetaste</w:t>
+      </w:r>
     </w:p>
     <w:p>
       <w:pPr>
@@ -1940,6 +1930,14 @@
           <w:szCs w:val="16"/>
         </w:rPr>
       </w:pPr>
+      <w:r>
+        <w:rPr>
+          <w:rFonts w:ascii="Courier New" w:hAnsi="Courier New" w:cs="Courier New"/>
+          <w:sz w:val="16"/>
+          <w:szCs w:val="16"/>
+        </w:rPr>
+        <w:t>Welt nach Runde: 2</w:t>
+      </w:r>
     </w:p>
     <w:p>
       <w:pPr>
@@ -1952,27 +1950,6 @@
           <w:szCs w:val="16"/>
         </w:rPr>
       </w:pPr>
-      <w:r>
-        <w:rPr>
-          <w:rFonts w:ascii="Courier New" w:hAnsi="Courier New" w:cs="Courier New"/>
-          <w:sz w:val="16"/>
-          <w:szCs w:val="16"/>
-        </w:rPr>
-        <w:t>Eingabetaste für nächste Runde oder x für Ende:</w:t>
-      </w:r>
-      <w:r>
-        <w:rPr>
-          <w:rFonts w:ascii="Courier New" w:hAnsi="Courier New" w:cs="Courier New"/>
-          <w:sz w:val="16"/>
-          <w:szCs w:val="16"/>
-        </w:rPr>
-        <w:br/>
-      </w:r>
-    </w:p>
-    <w:p>
-      <w:r>
-        <w:t>Nach dem Drücken der Eingabetaste</w:t>
-      </w:r>
     </w:p>
     <w:p>
       <w:pPr>
@@ -1985,15 +1962,6 @@
           <w:szCs w:val="16"/>
         </w:rPr>
       </w:pPr>
-      <w:r>
-        <w:rPr>
-          <w:rFonts w:ascii="Courier New" w:hAnsi="Courier New" w:cs="Courier New"/>
-          <w:sz w:val="16"/>
-          <w:szCs w:val="16"/>
-        </w:rPr>
-        <w:lastRenderedPageBreak/>
-        <w:t>Welt nach Runde: 2</w:t>
-      </w:r>
     </w:p>
     <w:p>
       <w:pPr>
@@ -2006,6 +1974,14 @@
           <w:szCs w:val="16"/>
         </w:rPr>
       </w:pPr>
+      <w:r>
+        <w:rPr>
+          <w:rFonts w:ascii="Courier New" w:hAnsi="Courier New" w:cs="Courier New"/>
+          <w:sz w:val="16"/>
+          <w:szCs w:val="16"/>
+        </w:rPr>
+        <w:t xml:space="preserve">      XXXX</w:t>
+      </w:r>
     </w:p>
     <w:p>
       <w:pPr>
@@ -2018,6 +1994,34 @@
           <w:szCs w:val="16"/>
         </w:rPr>
       </w:pPr>
+      <w:r>
+        <w:rPr>
+          <w:rFonts w:ascii="Courier New" w:hAnsi="Courier New" w:cs="Courier New"/>
+          <w:sz w:val="16"/>
+          <w:szCs w:val="16"/>
+        </w:rPr>
+        <w:t xml:space="preserve">     </w:t>
+      </w:r>
+      <w:proofErr w:type="gramStart"/>
+      <w:r>
+        <w:rPr>
+          <w:rFonts w:ascii="Courier New" w:hAnsi="Courier New" w:cs="Courier New"/>
+          <w:sz w:val="16"/>
+          <w:szCs w:val="16"/>
+        </w:rPr>
+        <w:t xml:space="preserve">X  </w:t>
+      </w:r>
+      <w:proofErr w:type="spellStart"/>
+      <w:r>
+        <w:rPr>
+          <w:rFonts w:ascii="Courier New" w:hAnsi="Courier New" w:cs="Courier New"/>
+          <w:sz w:val="16"/>
+          <w:szCs w:val="16"/>
+        </w:rPr>
+        <w:t>X</w:t>
+      </w:r>
+      <w:proofErr w:type="spellEnd"/>
+      <w:proofErr w:type="gramEnd"/>
     </w:p>
     <w:p>
       <w:pPr>
@@ -2036,8 +2040,28 @@
           <w:sz w:val="16"/>
           <w:szCs w:val="16"/>
         </w:rPr>
-        <w:t xml:space="preserve">      XX</w:t>
-      </w:r>
+        <w:t xml:space="preserve">     </w:t>
+      </w:r>
+      <w:proofErr w:type="gramStart"/>
+      <w:r>
+        <w:rPr>
+          <w:rFonts w:ascii="Courier New" w:hAnsi="Courier New" w:cs="Courier New"/>
+          <w:sz w:val="16"/>
+          <w:szCs w:val="16"/>
+        </w:rPr>
+        <w:t xml:space="preserve">X  </w:t>
+      </w:r>
+      <w:proofErr w:type="spellStart"/>
+      <w:r>
+        <w:rPr>
+          <w:rFonts w:ascii="Courier New" w:hAnsi="Courier New" w:cs="Courier New"/>
+          <w:sz w:val="16"/>
+          <w:szCs w:val="16"/>
+        </w:rPr>
+        <w:t>X</w:t>
+      </w:r>
+      <w:proofErr w:type="spellEnd"/>
+      <w:proofErr w:type="gramEnd"/>
     </w:p>
     <w:p>
       <w:pPr>
@@ -2056,18 +2080,8 @@
           <w:sz w:val="16"/>
           <w:szCs w:val="16"/>
         </w:rPr>
-        <w:t xml:space="preserve">     X  </w:t>
-      </w:r>
-      <w:proofErr w:type="spellStart"/>
-      <w:r>
-        <w:rPr>
-          <w:rFonts w:ascii="Courier New" w:hAnsi="Courier New" w:cs="Courier New"/>
-          <w:sz w:val="16"/>
-          <w:szCs w:val="16"/>
-        </w:rPr>
-        <w:t>X</w:t>
-      </w:r>
-      <w:proofErr w:type="spellEnd"/>
+        <w:t xml:space="preserve">        X</w:t>
+      </w:r>
     </w:p>
     <w:p>
       <w:pPr>
@@ -2086,7 +2100,7 @@
           <w:sz w:val="16"/>
           <w:szCs w:val="16"/>
         </w:rPr>
-        <w:t xml:space="preserve">     X  </w:t>
+        <w:t xml:space="preserve">       XX </w:t>
       </w:r>
       <w:proofErr w:type="spellStart"/>
       <w:r>
@@ -2095,7 +2109,7 @@
           <w:sz w:val="16"/>
           <w:szCs w:val="16"/>
         </w:rPr>
-        <w:t>X</w:t>
+        <w:t>XX</w:t>
       </w:r>
       <w:proofErr w:type="spellEnd"/>
     </w:p>
@@ -2116,18 +2130,18 @@
           <w:sz w:val="16"/>
           <w:szCs w:val="16"/>
         </w:rPr>
-        <w:t xml:space="preserve">     X  </w:t>
-      </w:r>
-      <w:proofErr w:type="spellStart"/>
-      <w:r>
-        <w:rPr>
-          <w:rFonts w:ascii="Courier New" w:hAnsi="Courier New" w:cs="Courier New"/>
-          <w:sz w:val="16"/>
-          <w:szCs w:val="16"/>
-        </w:rPr>
-        <w:t>X</w:t>
-      </w:r>
-      <w:proofErr w:type="spellEnd"/>
+        <w:t xml:space="preserve">      </w:t>
+      </w:r>
+      <w:proofErr w:type="gramStart"/>
+      <w:r>
+        <w:rPr>
+          <w:rFonts w:ascii="Courier New" w:hAnsi="Courier New" w:cs="Courier New"/>
+          <w:sz w:val="16"/>
+          <w:szCs w:val="16"/>
+        </w:rPr>
+        <w:t>XX  XXX</w:t>
+      </w:r>
+      <w:proofErr w:type="gramEnd"/>
     </w:p>
     <w:p>
       <w:pPr>
@@ -2146,140 +2160,8 @@
           <w:sz w:val="16"/>
           <w:szCs w:val="16"/>
         </w:rPr>
-        <w:t xml:space="preserve">       XX </w:t>
-      </w:r>
-      <w:proofErr w:type="spellStart"/>
-      <w:r>
-        <w:rPr>
-          <w:rFonts w:ascii="Courier New" w:hAnsi="Courier New" w:cs="Courier New"/>
-          <w:sz w:val="16"/>
-          <w:szCs w:val="16"/>
-        </w:rPr>
-        <w:t>XX</w:t>
-      </w:r>
-      <w:proofErr w:type="spellEnd"/>
-    </w:p>
-    <w:p>
-      <w:pPr>
-        <w:keepNext/>
-        <w:keepLines/>
-        <w:spacing w:after="0" w:line="240" w:lineRule="auto"/>
-        <w:rPr>
-          <w:rFonts w:ascii="Courier New" w:hAnsi="Courier New" w:cs="Courier New"/>
-          <w:sz w:val="16"/>
-          <w:szCs w:val="16"/>
-        </w:rPr>
-      </w:pPr>
-      <w:r>
-        <w:rPr>
-          <w:rFonts w:ascii="Courier New" w:hAnsi="Courier New" w:cs="Courier New"/>
-          <w:sz w:val="16"/>
-          <w:szCs w:val="16"/>
-        </w:rPr>
-        <w:t xml:space="preserve">      XX  </w:t>
-      </w:r>
-      <w:proofErr w:type="spellStart"/>
-      <w:r>
-        <w:rPr>
-          <w:rFonts w:ascii="Courier New" w:hAnsi="Courier New" w:cs="Courier New"/>
-          <w:sz w:val="16"/>
-          <w:szCs w:val="16"/>
-        </w:rPr>
-        <w:t>XX</w:t>
-      </w:r>
-      <w:proofErr w:type="spellEnd"/>
-      <w:r>
-        <w:rPr>
-          <w:rFonts w:ascii="Courier New" w:hAnsi="Courier New" w:cs="Courier New"/>
-          <w:sz w:val="16"/>
-          <w:szCs w:val="16"/>
-        </w:rPr>
-        <w:t xml:space="preserve"> X</w:t>
-      </w:r>
-    </w:p>
-    <w:p>
-      <w:pPr>
-        <w:keepNext/>
-        <w:keepLines/>
-        <w:spacing w:after="0" w:line="240" w:lineRule="auto"/>
-        <w:rPr>
-          <w:rFonts w:ascii="Courier New" w:hAnsi="Courier New" w:cs="Courier New"/>
-          <w:sz w:val="16"/>
-          <w:szCs w:val="16"/>
-        </w:rPr>
-      </w:pPr>
-      <w:r>
-        <w:rPr>
-          <w:rFonts w:ascii="Courier New" w:hAnsi="Courier New" w:cs="Courier New"/>
-          <w:sz w:val="16"/>
-          <w:szCs w:val="16"/>
-        </w:rPr>
-        <w:t xml:space="preserve">      XXX   XX</w:t>
-      </w:r>
-    </w:p>
-    <w:p>
-      <w:pPr>
-        <w:keepNext/>
-        <w:keepLines/>
-        <w:spacing w:after="0" w:line="240" w:lineRule="auto"/>
-        <w:rPr>
-          <w:rFonts w:ascii="Courier New" w:hAnsi="Courier New" w:cs="Courier New"/>
-          <w:sz w:val="16"/>
-          <w:szCs w:val="16"/>
-        </w:rPr>
-      </w:pPr>
-    </w:p>
-    <w:p>
-      <w:pPr>
-        <w:keepNext/>
-        <w:keepLines/>
-        <w:spacing w:after="0" w:line="240" w:lineRule="auto"/>
-        <w:rPr>
-          <w:rFonts w:ascii="Courier New" w:hAnsi="Courier New" w:cs="Courier New"/>
-          <w:sz w:val="16"/>
-          <w:szCs w:val="16"/>
-        </w:rPr>
-      </w:pPr>
-      <w:r>
-        <w:rPr>
-          <w:rFonts w:ascii="Courier New" w:hAnsi="Courier New" w:cs="Courier New"/>
-          <w:sz w:val="16"/>
-          <w:szCs w:val="16"/>
-        </w:rPr>
-        <w:t xml:space="preserve">            X</w:t>
-      </w:r>
-    </w:p>
-    <w:p>
-      <w:pPr>
-        <w:keepNext/>
-        <w:keepLines/>
-        <w:spacing w:after="0" w:line="240" w:lineRule="auto"/>
-        <w:rPr>
-          <w:rFonts w:ascii="Courier New" w:hAnsi="Courier New" w:cs="Courier New"/>
-          <w:sz w:val="16"/>
-          <w:szCs w:val="16"/>
-        </w:rPr>
-      </w:pPr>
-      <w:r>
-        <w:rPr>
-          <w:rFonts w:ascii="Courier New" w:hAnsi="Courier New" w:cs="Courier New"/>
-          <w:sz w:val="16"/>
-          <w:szCs w:val="16"/>
-        </w:rPr>
-        <w:t xml:space="preserve">            X</w:t>
-      </w:r>
-    </w:p>
-    <w:p>
-      <w:pPr>
-        <w:keepNext/>
-        <w:keepLines/>
-        <w:spacing w:after="0" w:line="240" w:lineRule="auto"/>
-        <w:rPr>
-          <w:rFonts w:ascii="Courier New" w:hAnsi="Courier New" w:cs="Courier New"/>
-          <w:sz w:val="16"/>
-          <w:szCs w:val="16"/>
-        </w:rPr>
-      </w:pPr>
+        <w:t xml:space="preserve">      XXX</w:t>
+      </w:r>
     </w:p>
     <w:p>
       <w:pPr>
@@ -2326,7 +2208,7 @@
 </file>
 
 <file path=word/endnotes.xml><?xml version="1.0" encoding="utf-8"?>
-<w:endnotes xmlns:wpc="http://schemas.microsoft.com/office/word/2010/wordprocessingCanvas" xmlns:mc="http://schemas.openxmlformats.org/markup-compatibility/2006" xmlns:o="urn:schemas-microsoft-com:office:office" xmlns:r="http://schemas.openxmlformats.org/officeDocument/2006/relationships" xmlns:m="http://schemas.openxmlformats.org/officeDocument/2006/math" xmlns:v="urn:schemas-microsoft-com:vml" xmlns:wp14="http://schemas.microsoft.com/office/word/2010/wordprocessingDrawing" xmlns:wp="http://schemas.openxmlformats.org/drawingml/2006/wordprocessingDrawing" xmlns:w10="urn:schemas-microsoft-com:office:word" xmlns:w="http://schemas.openxmlformats.org/wordprocessingml/2006/main" xmlns:w14="http://schemas.microsoft.com/office/word/2010/wordml" xmlns:w15="http://schemas.microsoft.com/office/word/2012/wordml" xmlns:wpg="http://schemas.microsoft.com/office/word/2010/wordprocessingGroup" xmlns:wpi="http://schemas.microsoft.com/office/word/2010/wordprocessingInk" xmlns:wne="http://schemas.microsoft.com/office/word/2006/wordml" xmlns:wps="http://schemas.microsoft.com/office/word/2010/wordprocessingShape" mc:Ignorable="w14 w15 wp14">
+<w:endnotes xmlns:wpc="http://schemas.microsoft.com/office/word/2010/wordprocessingCanvas" xmlns:cx="http://schemas.microsoft.com/office/drawing/2014/chartex" xmlns:cx1="http://schemas.microsoft.com/office/drawing/2015/9/8/chartex" xmlns:cx2="http://schemas.microsoft.com/office/drawing/2015/10/21/chartex" xmlns:cx3="http://schemas.microsoft.com/office/drawing/2016/5/9/chartex" xmlns:cx4="http://schemas.microsoft.com/office/drawing/2016/5/10/chartex" xmlns:cx5="http://schemas.microsoft.com/office/drawing/2016/5/11/chartex" xmlns:cx6="http://schemas.microsoft.com/office/drawing/2016/5/12/chartex" xmlns:cx7="http://schemas.microsoft.com/office/drawing/2016/5/13/chartex" xmlns:cx8="http://schemas.microsoft.com/office/drawing/2016/5/14/chartex" xmlns:mc="http://schemas.openxmlformats.org/markup-compatibility/2006" xmlns:aink="http://schemas.microsoft.com/office/drawing/2016/ink" xmlns:am3d="http://schemas.microsoft.com/office/drawing/2017/model3d" xmlns:o="urn:schemas-microsoft-com:office:office" xmlns:r="http://schemas.openxmlformats.org/officeDocument/2006/relationships" xmlns:m="http://schemas.openxmlformats.org/officeDocument/2006/math" xmlns:v="urn:schemas-microsoft-com:vml" xmlns:wp14="http://schemas.microsoft.com/office/word/2010/wordprocessingDrawing" xmlns:wp="http://schemas.openxmlformats.org/drawingml/2006/wordprocessingDrawing" xmlns:w10="urn:schemas-microsoft-com:office:word" xmlns:w="http://schemas.openxmlformats.org/wordprocessingml/2006/main" xmlns:w14="http://schemas.microsoft.com/office/word/2010/wordml" xmlns:w15="http://schemas.microsoft.com/office/word/2012/wordml" xmlns:w16cex="http://schemas.microsoft.com/office/word/2018/wordml/cex" xmlns:w16cid="http://schemas.microsoft.com/office/word/2016/wordml/cid" xmlns:w16="http://schemas.microsoft.com/office/word/2018/wordml" xmlns:w16sdtdh="http://schemas.microsoft.com/office/word/2020/wordml/sdtdatahash" xmlns:w16se="http://schemas.microsoft.com/office/word/2015/wordml/symex" xmlns:wpg="http://schemas.microsoft.com/office/word/2010/wordprocessingGroup" xmlns:wpi="http://schemas.microsoft.com/office/word/2010/wordprocessingInk" xmlns:wne="http://schemas.microsoft.com/office/word/2006/wordml" xmlns:wps="http://schemas.microsoft.com/office/word/2010/wordprocessingShape" mc:Ignorable="w14 w15 w16se w16cid w16 w16cex w16sdtdh wp14">
   <w:endnote w:type="separator" w:id="-1">
     <w:p>
       <w:pPr>
@@ -2351,7 +2233,7 @@
 </file>
 
 <file path=word/footer1.xml><?xml version="1.0" encoding="utf-8"?>
-<w:ftr xmlns:wpc="http://schemas.microsoft.com/office/word/2010/wordprocessingCanvas" xmlns:mc="http://schemas.openxmlformats.org/markup-compatibility/2006" xmlns:o="urn:schemas-microsoft-com:office:office" xmlns:r="http://schemas.openxmlformats.org/officeDocument/2006/relationships" xmlns:m="http://schemas.openxmlformats.org/officeDocument/2006/math" xmlns:v="urn:schemas-microsoft-com:vml" xmlns:wp14="http://schemas.microsoft.com/office/word/2010/wordprocessingDrawing" xmlns:wp="http://schemas.openxmlformats.org/drawingml/2006/wordprocessingDrawing" xmlns:w10="urn:schemas-microsoft-com:office:word" xmlns:w="http://schemas.openxmlformats.org/wordprocessingml/2006/main" xmlns:w14="http://schemas.microsoft.com/office/word/2010/wordml" xmlns:w15="http://schemas.microsoft.com/office/word/2012/wordml" xmlns:wpg="http://schemas.microsoft.com/office/word/2010/wordprocessingGroup" xmlns:wpi="http://schemas.microsoft.com/office/word/2010/wordprocessingInk" xmlns:wne="http://schemas.microsoft.com/office/word/2006/wordml" xmlns:wps="http://schemas.microsoft.com/office/word/2010/wordprocessingShape" mc:Ignorable="w14 w15 wp14">
+<w:ftr xmlns:wpc="http://schemas.microsoft.com/office/word/2010/wordprocessingCanvas" xmlns:cx="http://schemas.microsoft.com/office/drawing/2014/chartex" xmlns:cx1="http://schemas.microsoft.com/office/drawing/2015/9/8/chartex" xmlns:cx2="http://schemas.microsoft.com/office/drawing/2015/10/21/chartex" xmlns:cx3="http://schemas.microsoft.com/office/drawing/2016/5/9/chartex" xmlns:cx4="http://schemas.microsoft.com/office/drawing/2016/5/10/chartex" xmlns:cx5="http://schemas.microsoft.com/office/drawing/2016/5/11/chartex" xmlns:cx6="http://schemas.microsoft.com/office/drawing/2016/5/12/chartex" xmlns:cx7="http://schemas.microsoft.com/office/drawing/2016/5/13/chartex" xmlns:cx8="http://schemas.microsoft.com/office/drawing/2016/5/14/chartex" xmlns:mc="http://schemas.openxmlformats.org/markup-compatibility/2006" xmlns:aink="http://schemas.microsoft.com/office/drawing/2016/ink" xmlns:am3d="http://schemas.microsoft.com/office/drawing/2017/model3d" xmlns:o="urn:schemas-microsoft-com:office:office" xmlns:r="http://schemas.openxmlformats.org/officeDocument/2006/relationships" xmlns:m="http://schemas.openxmlformats.org/officeDocument/2006/math" xmlns:v="urn:schemas-microsoft-com:vml" xmlns:wp14="http://schemas.microsoft.com/office/word/2010/wordprocessingDrawing" xmlns:wp="http://schemas.openxmlformats.org/drawingml/2006/wordprocessingDrawing" xmlns:w10="urn:schemas-microsoft-com:office:word" xmlns:w="http://schemas.openxmlformats.org/wordprocessingml/2006/main" xmlns:w14="http://schemas.microsoft.com/office/word/2010/wordml" xmlns:w15="http://schemas.microsoft.com/office/word/2012/wordml" xmlns:w16cex="http://schemas.microsoft.com/office/word/2018/wordml/cex" xmlns:w16cid="http://schemas.microsoft.com/office/word/2016/wordml/cid" xmlns:w16="http://schemas.microsoft.com/office/word/2018/wordml" xmlns:w16sdtdh="http://schemas.microsoft.com/office/word/2020/wordml/sdtdatahash" xmlns:w16se="http://schemas.microsoft.com/office/word/2015/wordml/symex" xmlns:wpg="http://schemas.microsoft.com/office/word/2010/wordprocessingGroup" xmlns:wpi="http://schemas.microsoft.com/office/word/2010/wordprocessingInk" xmlns:wne="http://schemas.microsoft.com/office/word/2006/wordml" xmlns:wps="http://schemas.microsoft.com/office/word/2010/wordprocessingShape" mc:Ignorable="w14 w15 w16se w16cid w16 w16cex w16sdtdh wp14">
   <w:sdt>
     <w:sdtPr>
       <w:id w:val="-883172744"/>
@@ -2393,7 +2275,7 @@
 </file>
 
 <file path=word/footnotes.xml><?xml version="1.0" encoding="utf-8"?>
-<w:footnotes xmlns:wpc="http://schemas.microsoft.com/office/word/2010/wordprocessingCanvas" xmlns:mc="http://schemas.openxmlformats.org/markup-compatibility/2006" xmlns:o="urn:schemas-microsoft-com:office:office" xmlns:r="http://schemas.openxmlformats.org/officeDocument/2006/relationships" xmlns:m="http://schemas.openxmlformats.org/officeDocument/2006/math" xmlns:v="urn:schemas-microsoft-com:vml" xmlns:wp14="http://schemas.microsoft.com/office/word/2010/wordprocessingDrawing" xmlns:wp="http://schemas.openxmlformats.org/drawingml/2006/wordprocessingDrawing" xmlns:w10="urn:schemas-microsoft-com:office:word" xmlns:w="http://schemas.openxmlformats.org/wordprocessingml/2006/main" xmlns:w14="http://schemas.microsoft.com/office/word/2010/wordml" xmlns:w15="http://schemas.microsoft.com/office/word/2012/wordml" xmlns:wpg="http://schemas.microsoft.com/office/word/2010/wordprocessingGroup" xmlns:wpi="http://schemas.microsoft.com/office/word/2010/wordprocessingInk" xmlns:wne="http://schemas.microsoft.com/office/word/2006/wordml" xmlns:wps="http://schemas.microsoft.com/office/word/2010/wordprocessingShape" mc:Ignorable="w14 w15 wp14">
+<w:footnotes xmlns:wpc="http://schemas.microsoft.com/office/word/2010/wordprocessingCanvas" xmlns:cx="http://schemas.microsoft.com/office/drawing/2014/chartex" xmlns:cx1="http://schemas.microsoft.com/office/drawing/2015/9/8/chartex" xmlns:cx2="http://schemas.microsoft.com/office/drawing/2015/10/21/chartex" xmlns:cx3="http://schemas.microsoft.com/office/drawing/2016/5/9/chartex" xmlns:cx4="http://schemas.microsoft.com/office/drawing/2016/5/10/chartex" xmlns:cx5="http://schemas.microsoft.com/office/drawing/2016/5/11/chartex" xmlns:cx6="http://schemas.microsoft.com/office/drawing/2016/5/12/chartex" xmlns:cx7="http://schemas.microsoft.com/office/drawing/2016/5/13/chartex" xmlns:cx8="http://schemas.microsoft.com/office/drawing/2016/5/14/chartex" xmlns:mc="http://schemas.openxmlformats.org/markup-compatibility/2006" xmlns:aink="http://schemas.microsoft.com/office/drawing/2016/ink" xmlns:am3d="http://schemas.microsoft.com/office/drawing/2017/model3d" xmlns:o="urn:schemas-microsoft-com:office:office" xmlns:r="http://schemas.openxmlformats.org/officeDocument/2006/relationships" xmlns:m="http://schemas.openxmlformats.org/officeDocument/2006/math" xmlns:v="urn:schemas-microsoft-com:vml" xmlns:wp14="http://schemas.microsoft.com/office/word/2010/wordprocessingDrawing" xmlns:wp="http://schemas.openxmlformats.org/drawingml/2006/wordprocessingDrawing" xmlns:w10="urn:schemas-microsoft-com:office:word" xmlns:w="http://schemas.openxmlformats.org/wordprocessingml/2006/main" xmlns:w14="http://schemas.microsoft.com/office/word/2010/wordml" xmlns:w15="http://schemas.microsoft.com/office/word/2012/wordml" xmlns:w16cex="http://schemas.microsoft.com/office/word/2018/wordml/cex" xmlns:w16cid="http://schemas.microsoft.com/office/word/2016/wordml/cid" xmlns:w16="http://schemas.microsoft.com/office/word/2018/wordml" xmlns:w16sdtdh="http://schemas.microsoft.com/office/word/2020/wordml/sdtdatahash" xmlns:w16se="http://schemas.microsoft.com/office/word/2015/wordml/symex" xmlns:wpg="http://schemas.microsoft.com/office/word/2010/wordprocessingGroup" xmlns:wpi="http://schemas.microsoft.com/office/word/2010/wordprocessingInk" xmlns:wne="http://schemas.microsoft.com/office/word/2006/wordml" xmlns:wps="http://schemas.microsoft.com/office/word/2010/wordprocessingShape" mc:Ignorable="w14 w15 w16se w16cid w16 w16cex w16sdtdh wp14">
   <w:footnote w:type="separator" w:id="-1">
     <w:p>
       <w:pPr>
@@ -2418,7 +2300,7 @@
 </file>
 
 <file path=word/header1.xml><?xml version="1.0" encoding="utf-8"?>
-<w:hdr xmlns:wpc="http://schemas.microsoft.com/office/word/2010/wordprocessingCanvas" xmlns:mc="http://schemas.openxmlformats.org/markup-compatibility/2006" xmlns:o="urn:schemas-microsoft-com:office:office" xmlns:r="http://schemas.openxmlformats.org/officeDocument/2006/relationships" xmlns:m="http://schemas.openxmlformats.org/officeDocument/2006/math" xmlns:v="urn:schemas-microsoft-com:vml" xmlns:wp14="http://schemas.microsoft.com/office/word/2010/wordprocessingDrawing" xmlns:wp="http://schemas.openxmlformats.org/drawingml/2006/wordprocessingDrawing" xmlns:w10="urn:schemas-microsoft-com:office:word" xmlns:w="http://schemas.openxmlformats.org/wordprocessingml/2006/main" xmlns:w14="http://schemas.microsoft.com/office/word/2010/wordml" xmlns:w15="http://schemas.microsoft.com/office/word/2012/wordml" xmlns:wpg="http://schemas.microsoft.com/office/word/2010/wordprocessingGroup" xmlns:wpi="http://schemas.microsoft.com/office/word/2010/wordprocessingInk" xmlns:wne="http://schemas.microsoft.com/office/word/2006/wordml" xmlns:wps="http://schemas.microsoft.com/office/word/2010/wordprocessingShape" mc:Ignorable="w14 w15 wp14">
+<w:hdr xmlns:wpc="http://schemas.microsoft.com/office/word/2010/wordprocessingCanvas" xmlns:cx="http://schemas.microsoft.com/office/drawing/2014/chartex" xmlns:cx1="http://schemas.microsoft.com/office/drawing/2015/9/8/chartex" xmlns:cx2="http://schemas.microsoft.com/office/drawing/2015/10/21/chartex" xmlns:cx3="http://schemas.microsoft.com/office/drawing/2016/5/9/chartex" xmlns:cx4="http://schemas.microsoft.com/office/drawing/2016/5/10/chartex" xmlns:cx5="http://schemas.microsoft.com/office/drawing/2016/5/11/chartex" xmlns:cx6="http://schemas.microsoft.com/office/drawing/2016/5/12/chartex" xmlns:cx7="http://schemas.microsoft.com/office/drawing/2016/5/13/chartex" xmlns:cx8="http://schemas.microsoft.com/office/drawing/2016/5/14/chartex" xmlns:mc="http://schemas.openxmlformats.org/markup-compatibility/2006" xmlns:aink="http://schemas.microsoft.com/office/drawing/2016/ink" xmlns:am3d="http://schemas.microsoft.com/office/drawing/2017/model3d" xmlns:o="urn:schemas-microsoft-com:office:office" xmlns:r="http://schemas.openxmlformats.org/officeDocument/2006/relationships" xmlns:m="http://schemas.openxmlformats.org/officeDocument/2006/math" xmlns:v="urn:schemas-microsoft-com:vml" xmlns:wp14="http://schemas.microsoft.com/office/word/2010/wordprocessingDrawing" xmlns:wp="http://schemas.openxmlformats.org/drawingml/2006/wordprocessingDrawing" xmlns:w10="urn:schemas-microsoft-com:office:word" xmlns:w="http://schemas.openxmlformats.org/wordprocessingml/2006/main" xmlns:w14="http://schemas.microsoft.com/office/word/2010/wordml" xmlns:w15="http://schemas.microsoft.com/office/word/2012/wordml" xmlns:w16cex="http://schemas.microsoft.com/office/word/2018/wordml/cex" xmlns:w16cid="http://schemas.microsoft.com/office/word/2016/wordml/cid" xmlns:w16="http://schemas.microsoft.com/office/word/2018/wordml" xmlns:w16sdtdh="http://schemas.microsoft.com/office/word/2020/wordml/sdtdatahash" xmlns:w16se="http://schemas.microsoft.com/office/word/2015/wordml/symex" xmlns:wpg="http://schemas.microsoft.com/office/word/2010/wordprocessingGroup" xmlns:wpi="http://schemas.microsoft.com/office/word/2010/wordprocessingInk" xmlns:wne="http://schemas.microsoft.com/office/word/2006/wordml" xmlns:wps="http://schemas.microsoft.com/office/word/2010/wordprocessingShape" mc:Ignorable="w14 w15 w16se w16cid w16 w16cex w16sdtdh wp14">
   <w:tbl>
     <w:tblPr>
       <w:tblStyle w:val="Tabellenraster"/>
@@ -2604,7 +2486,7 @@
 </file>
 
 <file path=word/numbering.xml><?xml version="1.0" encoding="utf-8"?>
-<w:numbering xmlns:wpc="http://schemas.microsoft.com/office/word/2010/wordprocessingCanvas" xmlns:mc="http://schemas.openxmlformats.org/markup-compatibility/2006" xmlns:o="urn:schemas-microsoft-com:office:office" xmlns:r="http://schemas.openxmlformats.org/officeDocument/2006/relationships" xmlns:m="http://schemas.openxmlformats.org/officeDocument/2006/math" xmlns:v="urn:schemas-microsoft-com:vml" xmlns:wp14="http://schemas.microsoft.com/office/word/2010/wordprocessingDrawing" xmlns:wp="http://schemas.openxmlformats.org/drawingml/2006/wordprocessingDrawing" xmlns:w10="urn:schemas-microsoft-com:office:word" xmlns:w="http://schemas.openxmlformats.org/wordprocessingml/2006/main" xmlns:w14="http://schemas.microsoft.com/office/word/2010/wordml" xmlns:w15="http://schemas.microsoft.com/office/word/2012/wordml" xmlns:wpg="http://schemas.microsoft.com/office/word/2010/wordprocessingGroup" xmlns:wpi="http://schemas.microsoft.com/office/word/2010/wordprocessingInk" xmlns:wne="http://schemas.microsoft.com/office/word/2006/wordml" xmlns:wps="http://schemas.microsoft.com/office/word/2010/wordprocessingShape" mc:Ignorable="w14 w15 wp14">
+<w:numbering xmlns:wpc="http://schemas.microsoft.com/office/word/2010/wordprocessingCanvas" xmlns:cx="http://schemas.microsoft.com/office/drawing/2014/chartex" xmlns:cx1="http://schemas.microsoft.com/office/drawing/2015/9/8/chartex" xmlns:cx2="http://schemas.microsoft.com/office/drawing/2015/10/21/chartex" xmlns:cx3="http://schemas.microsoft.com/office/drawing/2016/5/9/chartex" xmlns:cx4="http://schemas.microsoft.com/office/drawing/2016/5/10/chartex" xmlns:cx5="http://schemas.microsoft.com/office/drawing/2016/5/11/chartex" xmlns:cx6="http://schemas.microsoft.com/office/drawing/2016/5/12/chartex" xmlns:cx7="http://schemas.microsoft.com/office/drawing/2016/5/13/chartex" xmlns:cx8="http://schemas.microsoft.com/office/drawing/2016/5/14/chartex" xmlns:mc="http://schemas.openxmlformats.org/markup-compatibility/2006" xmlns:aink="http://schemas.microsoft.com/office/drawing/2016/ink" xmlns:am3d="http://schemas.microsoft.com/office/drawing/2017/model3d" xmlns:o="urn:schemas-microsoft-com:office:office" xmlns:r="http://schemas.openxmlformats.org/officeDocument/2006/relationships" xmlns:m="http://schemas.openxmlformats.org/officeDocument/2006/math" xmlns:v="urn:schemas-microsoft-com:vml" xmlns:wp14="http://schemas.microsoft.com/office/word/2010/wordprocessingDrawing" xmlns:wp="http://schemas.openxmlformats.org/drawingml/2006/wordprocessingDrawing" xmlns:w10="urn:schemas-microsoft-com:office:word" xmlns:w="http://schemas.openxmlformats.org/wordprocessingml/2006/main" xmlns:w14="http://schemas.microsoft.com/office/word/2010/wordml" xmlns:w15="http://schemas.microsoft.com/office/word/2012/wordml" xmlns:w16cex="http://schemas.microsoft.com/office/word/2018/wordml/cex" xmlns:w16cid="http://schemas.microsoft.com/office/word/2016/wordml/cid" xmlns:w16="http://schemas.microsoft.com/office/word/2018/wordml" xmlns:w16sdtdh="http://schemas.microsoft.com/office/word/2020/wordml/sdtdatahash" xmlns:w16se="http://schemas.microsoft.com/office/word/2015/wordml/symex" xmlns:wpg="http://schemas.microsoft.com/office/word/2010/wordprocessingGroup" xmlns:wpi="http://schemas.microsoft.com/office/word/2010/wordprocessingInk" xmlns:wne="http://schemas.microsoft.com/office/word/2006/wordml" xmlns:wps="http://schemas.microsoft.com/office/word/2010/wordprocessingShape" mc:Ignorable="w14 w15 w16se w16cid w16 w16cex w16sdtdh wp14">
   <w:abstractNum w:abstractNumId="0" w15:restartNumberingAfterBreak="0">
     <w:nsid w:val="05F548AE"/>
     <w:multiLevelType w:val="hybridMultilevel"/>
@@ -5567,7 +5449,7 @@
 </file>
 
 <file path=word/styles.xml><?xml version="1.0" encoding="utf-8"?>
-<w:styles xmlns:mc="http://schemas.openxmlformats.org/markup-compatibility/2006" xmlns:r="http://schemas.openxmlformats.org/officeDocument/2006/relationships" xmlns:w="http://schemas.openxmlformats.org/wordprocessingml/2006/main" xmlns:w14="http://schemas.microsoft.com/office/word/2010/wordml" xmlns:w15="http://schemas.microsoft.com/office/word/2012/wordml" mc:Ignorable="w14 w15">
+<w:styles xmlns:mc="http://schemas.openxmlformats.org/markup-compatibility/2006" xmlns:r="http://schemas.openxmlformats.org/officeDocument/2006/relationships" xmlns:w="http://schemas.openxmlformats.org/wordprocessingml/2006/main" xmlns:w14="http://schemas.microsoft.com/office/word/2010/wordml" xmlns:w15="http://schemas.microsoft.com/office/word/2012/wordml" xmlns:w16cex="http://schemas.microsoft.com/office/word/2018/wordml/cex" xmlns:w16cid="http://schemas.microsoft.com/office/word/2016/wordml/cid" xmlns:w16="http://schemas.microsoft.com/office/word/2018/wordml" xmlns:w16sdtdh="http://schemas.microsoft.com/office/word/2020/wordml/sdtdatahash" xmlns:w16se="http://schemas.microsoft.com/office/word/2015/wordml/symex" mc:Ignorable="w14 w15 w16se w16cid w16 w16cex w16sdtdh">
   <w:docDefaults>
     <w:rPrDefault>
       <w:rPr>
@@ -5583,7 +5465,7 @@
       </w:pPr>
     </w:pPrDefault>
   </w:docDefaults>
-  <w:latentStyles w:defLockedState="0" w:defUIPriority="99" w:defSemiHidden="0" w:defUnhideWhenUsed="0" w:defQFormat="0" w:count="371">
+  <w:latentStyles w:defLockedState="0" w:defUIPriority="99" w:defSemiHidden="0" w:defUnhideWhenUsed="0" w:defQFormat="0" w:count="376">
     <w:lsdException w:name="Normal" w:uiPriority="0" w:qFormat="1"/>
     <w:lsdException w:name="heading 1" w:uiPriority="9" w:qFormat="1"/>
     <w:lsdException w:name="heading 2" w:semiHidden="1" w:uiPriority="9" w:unhideWhenUsed="1" w:qFormat="1"/>
@@ -5689,7 +5571,6 @@
     <w:lsdException w:name="HTML Sample" w:semiHidden="1" w:unhideWhenUsed="1"/>
     <w:lsdException w:name="HTML Typewriter" w:semiHidden="1" w:unhideWhenUsed="1"/>
     <w:lsdException w:name="HTML Variable" w:semiHidden="1" w:unhideWhenUsed="1"/>
-    <w:lsdException w:name="Normal Table" w:semiHidden="1" w:unhideWhenUsed="1"/>
     <w:lsdException w:name="annotation subject" w:semiHidden="1" w:unhideWhenUsed="1"/>
     <w:lsdException w:name="No List" w:semiHidden="1" w:unhideWhenUsed="1"/>
     <w:lsdException w:name="Outline List 1" w:semiHidden="1" w:unhideWhenUsed="1"/>
@@ -5732,11 +5613,8 @@
     <w:lsdException w:name="Table Contemporary" w:semiHidden="1" w:unhideWhenUsed="1"/>
     <w:lsdException w:name="Table Elegant" w:semiHidden="1" w:unhideWhenUsed="1"/>
     <w:lsdException w:name="Table Professional" w:semiHidden="1" w:unhideWhenUsed="1"/>
-    <w:lsdException w:name="Table Subtle 1" w:semiHidden="1" w:unhideWhenUsed="1"/>
     <w:lsdException w:name="Table Subtle 2" w:semiHidden="1" w:unhideWhenUsed="1"/>
     <w:lsdException w:name="Table Web 1" w:semiHidden="1" w:unhideWhenUsed="1"/>
-    <w:lsdException w:name="Table Web 2" w:semiHidden="1" w:unhideWhenUsed="1"/>
-    <w:lsdException w:name="Table Web 3" w:semiHidden="1" w:unhideWhenUsed="1"/>
     <w:lsdException w:name="Balloon Text" w:semiHidden="1" w:unhideWhenUsed="1"/>
     <w:lsdException w:name="Table Grid" w:uiPriority="0"/>
     <w:lsdException w:name="Table Theme" w:semiHidden="1" w:unhideWhenUsed="1"/>
@@ -5955,6 +5833,11 @@
     <w:lsdException w:name="List Table 5 Dark Accent 6" w:uiPriority="50"/>
     <w:lsdException w:name="List Table 6 Colorful Accent 6" w:uiPriority="51"/>
     <w:lsdException w:name="List Table 7 Colorful Accent 6" w:uiPriority="52"/>
+    <w:lsdException w:name="Mention" w:semiHidden="1" w:unhideWhenUsed="1"/>
+    <w:lsdException w:name="Smart Hyperlink" w:semiHidden="1" w:unhideWhenUsed="1"/>
+    <w:lsdException w:name="Hashtag" w:semiHidden="1" w:unhideWhenUsed="1"/>
+    <w:lsdException w:name="Unresolved Mention" w:semiHidden="1" w:unhideWhenUsed="1"/>
+    <w:lsdException w:name="Smart Link" w:semiHidden="1" w:unhideWhenUsed="1"/>
   </w:latentStyles>
   <w:style w:type="paragraph" w:default="1" w:styleId="Standard">
     <w:name w:val="Normal"/>
@@ -6120,6 +6003,7 @@
   <w:style w:type="character" w:default="1" w:styleId="Absatz-Standardschriftart">
     <w:name w:val="Default Paragraph Font"/>
     <w:uiPriority w:val="1"/>
+    <w:semiHidden/>
     <w:unhideWhenUsed/>
   </w:style>
   <w:style w:type="table" w:default="1" w:styleId="NormaleTabelle">
@@ -6354,8 +6238,8 @@
       <w:lang w:val="de-DE" w:eastAsia="de-DE"/>
     </w:rPr>
   </w:style>
-  <w:style w:type="character" w:customStyle="1" w:styleId="UnresolvedMention">
-    <w:name w:val="Unresolved Mention"/>
+  <w:style w:type="character" w:customStyle="1" w:styleId="NichtaufgelsteErwhnung1">
+    <w:name w:val="Nicht aufgelöste Erwähnung1"/>
     <w:basedOn w:val="Absatz-Standardschriftart"/>
     <w:uiPriority w:val="99"/>
     <w:semiHidden/>
@@ -6387,7 +6271,7 @@
     <w:basedOn w:val="Absatz-Standardschriftart"/>
     <w:rsid w:val="00675B5F"/>
   </w:style>
-  <w:style w:type="character" w:styleId="BesuchterHyperlink">
+  <w:style w:type="character" w:styleId="BesuchterLink">
     <w:name w:val="FollowedHyperlink"/>
     <w:basedOn w:val="Absatz-Standardschriftart"/>
     <w:uiPriority w:val="99"/>

</xml_diff>